<commit_message>
Agregar instructivo de fotos (Cloudinary) al manual de inventario en lenguaje simple
Sección nueva con pasos concretos para subir una foto y pegar su link en la
pestaña Imagenes, sin dar por sentado ningún conocimiento técnico.
</commit_message>
<xml_diff>
--- a/docs/MANUAL_INVENTARIO.docx
+++ b/docs/MANUAL_INVENTARIO.docx
@@ -58,11 +58,13 @@
       </w:pPr>
       <w:r>
         <w:rPr>
+          <w:b w:val="false"/>
+          <w:bCs w:val="false"/>
           <w:i w:val="false"/>
           <w:iCs w:val="false"/>
           <w:color w:val="222222"/>
         </w:rPr>
-        <w:t xml:space="preserve">El catálogo de la página web de Tez Canela se alimenta de un Google Sheet (una hoja de cálculo, como Excel pero en la nube). Todo lo que se ve en la página — productos, precios, tallas, colores y disponibilidad — sale de ahí.</w:t>
+        <w:t xml:space="preserve">El catálogo de la página web de Tez Canela se alimenta de un Google Sheet (una hoja de cálculo, como Excel pero en la nube). Todo lo que se ve en la página — productos, precios, tallas, colores, disponibilidad y fotos — sale de ahí.</w:t>
       </w:r>
     </w:p>
     <w:p>
@@ -71,11 +73,13 @@
       </w:pPr>
       <w:r>
         <w:rPr>
+          <w:b w:val="false"/>
+          <w:bCs w:val="false"/>
           <w:i w:val="false"/>
           <w:iCs w:val="false"/>
           <w:color w:val="222222"/>
         </w:rPr>
-        <w:t xml:space="preserve">No es necesario saber programación ni tocar la página web para actualizar el catálogo: basta con editar el Sheet, y los cambios aparecen solos en la página.</w:t>
+        <w:t xml:space="preserve">No es necesario saber programación ni tocar la página web para actualizar el catálogo: basta con editar el Sheet (y subir las fotos donde se explica más abajo), y los cambios aparecen solos en la página.</w:t>
       </w:r>
     </w:p>
     <w:p>
@@ -98,6 +102,8 @@
       </w:pPr>
       <w:r>
         <w:rPr>
+          <w:b w:val="false"/>
+          <w:bCs w:val="false"/>
           <w:i/>
           <w:iCs/>
           <w:color w:val="222222"/>
@@ -111,11 +117,13 @@
       </w:pPr>
       <w:r>
         <w:rPr>
+          <w:b w:val="false"/>
+          <w:bCs w:val="false"/>
           <w:i w:val="false"/>
           <w:iCs w:val="false"/>
           <w:color w:val="222222"/>
         </w:rPr>
-        <w:t xml:space="preserve">El Sheet tiene dos pestañas, en la parte de abajo: "Productos" y "Variantes".</w:t>
+        <w:t xml:space="preserve">El Sheet tiene tres pestañas, en la parte de abajo: "Productos", "Variantes" e "Imagenes".</w:t>
       </w:r>
     </w:p>
     <w:p>
@@ -138,6 +146,8 @@
       </w:pPr>
       <w:r>
         <w:rPr>
+          <w:b w:val="false"/>
+          <w:bCs w:val="false"/>
           <w:i w:val="false"/>
           <w:iCs w:val="false"/>
           <w:color w:val="222222"/>
@@ -564,7 +574,7 @@
         <w:rPr>
           <w:color w:val="222222"/>
         </w:rPr>
-        <w:t xml:space="preserve">La columna "imagen" se puede dejar vacía por ahora — mientras no haya foto, la página muestra un cuadro con el nombre del producto.</w:t>
+        <w:t xml:space="preserve">Las fotos de este producto no van en esta pestaña — van en la pestaña "Imagenes", explicada más abajo. Mientras no haya foto, la página muestra un cuadro con el nombre del producto.</w:t>
       </w:r>
     </w:p>
     <w:p>
@@ -587,6 +597,8 @@
       </w:pPr>
       <w:r>
         <w:rPr>
+          <w:b w:val="false"/>
+          <w:bCs w:val="false"/>
           <w:i w:val="false"/>
           <w:iCs w:val="false"/>
           <w:color w:val="222222"/>
@@ -956,6 +968,8 @@
       </w:pPr>
       <w:r>
         <w:rPr>
+          <w:b w:val="false"/>
+          <w:bCs w:val="false"/>
           <w:i w:val="false"/>
           <w:iCs w:val="false"/>
           <w:color w:val="222222"/>
@@ -983,6 +997,8 @@
       </w:pPr>
       <w:r>
         <w:rPr>
+          <w:b w:val="false"/>
+          <w:bCs w:val="false"/>
           <w:i w:val="false"/>
           <w:iCs w:val="false"/>
           <w:color w:val="222222"/>
@@ -1010,11 +1026,22 @@
       </w:pPr>
       <w:r>
         <w:rPr>
+          <w:b w:val="false"/>
+          <w:bCs w:val="false"/>
           <w:i w:val="false"/>
           <w:iCs w:val="false"/>
           <w:color w:val="222222"/>
         </w:rPr>
         <w:t xml:space="preserve">Ir a la pestaña Productos, buscar el producto y escribir el nuevo número en la columna "precio".</w:t>
+      </w:r>
+    </w:p>
+    <w:p>
+      <w:pPr>
+        <w:pageBreakBefore/>
+      </w:pPr>
+      <w:r>
+        <w:br/>
+        <w:t xml:space="preserve"/>
       </w:r>
     </w:p>
     <w:p>
@@ -1028,93 +1055,43 @@
           <w:bCs/>
           <w:color w:val="111111"/>
         </w:rPr>
-        <w:t xml:space="preserve">Reglas importantes — qué NO hacer</w:t>
-      </w:r>
-    </w:p>
-    <w:p>
-      <w:pPr>
-        <w:pStyle w:val="ListParagraph"/>
-        <w:numPr>
-          <w:ilvl w:val="0"/>
-          <w:numId w:val="3"/>
-        </w:numPr>
-        <w:spacing w:after="80"/>
-      </w:pPr>
-      <w:r>
-        <w:rPr>
-          <w:color w:val="222222"/>
-        </w:rPr>
-        <w:t xml:space="preserve">No cambiar los nombres de las pestañas ("Productos" y "Variantes").</w:t>
-      </w:r>
-    </w:p>
-    <w:p>
-      <w:pPr>
-        <w:pStyle w:val="ListParagraph"/>
-        <w:numPr>
-          <w:ilvl w:val="0"/>
-          <w:numId w:val="3"/>
-        </w:numPr>
-        <w:spacing w:after="80"/>
-      </w:pPr>
-      <w:r>
-        <w:rPr>
-          <w:color w:val="222222"/>
-        </w:rPr>
-        <w:t xml:space="preserve">No cambiar ni borrar los encabezados de las columnas (la primera fila de cada pestaña).</w:t>
-      </w:r>
-    </w:p>
-    <w:p>
-      <w:pPr>
-        <w:pStyle w:val="ListParagraph"/>
-        <w:numPr>
-          <w:ilvl w:val="0"/>
-          <w:numId w:val="3"/>
-        </w:numPr>
-        <w:spacing w:after="80"/>
-      </w:pPr>
-      <w:r>
-        <w:rPr>
-          <w:color w:val="222222"/>
-        </w:rPr>
-        <w:t xml:space="preserve">No dejar el "id" o "producto_id" vacío — sin eso el producto no se puede relacionar con sus tallas y colores.</w:t>
-      </w:r>
-    </w:p>
-    <w:p>
-      <w:pPr>
-        <w:pStyle w:val="ListParagraph"/>
-        <w:numPr>
-          <w:ilvl w:val="0"/>
-          <w:numId w:val="3"/>
-        </w:numPr>
-        <w:spacing w:after="80"/>
-      </w:pPr>
-      <w:r>
-        <w:rPr>
-          <w:color w:val="222222"/>
-        </w:rPr>
-        <w:t xml:space="preserve">No repetir el mismo "id" en dos productos distintos.</w:t>
-      </w:r>
-    </w:p>
-    <w:p>
-      <w:pPr>
-        <w:pStyle w:val="ListParagraph"/>
-        <w:numPr>
-          <w:ilvl w:val="0"/>
-          <w:numId w:val="3"/>
-        </w:numPr>
-        <w:spacing w:after="80"/>
-      </w:pPr>
-      <w:r>
-        <w:rPr>
-          <w:color w:val="222222"/>
-        </w:rPr>
-        <w:t xml:space="preserve">En "precio" y "stock" escribir solo números, sin texto ni símbolos.</w:t>
-      </w:r>
-    </w:p>
-    <w:p>
-      <w:pPr>
-        <w:pStyle w:val="Heading1"/>
-        <w:spacing w:after="160" w:before="360"/>
+        <w:t xml:space="preserve">Pestaña "Imagenes" — cómo subir y agregar las fotos</w:t>
+      </w:r>
+    </w:p>
+    <w:p>
+      <w:pPr>
+        <w:spacing w:after="160"/>
+      </w:pPr>
+      <w:r>
+        <w:rPr>
+          <w:b w:val="false"/>
+          <w:bCs w:val="false"/>
+          <w:i w:val="false"/>
+          <w:iCs w:val="false"/>
+          <w:color w:val="222222"/>
+        </w:rPr>
+        <w:t xml:space="preserve">Un producto puede tener una o varias fotos (por ejemplo, una con modelo y otra sin modelo). Las fotos no se pegan directo en el Sheet — primero hay que subirlas a una página gratuita llamada Cloudinary, que es donde quedan guardadas para que la página web las pueda mostrar. Después, el link de esa foto se pega en la pestaña "Imagenes".</w:t>
+      </w:r>
+    </w:p>
+    <w:p>
+      <w:pPr>
+        <w:spacing w:after="160"/>
+      </w:pPr>
+      <w:r>
+        <w:rPr>
+          <w:b w:val="false"/>
+          <w:bCs w:val="false"/>
+          <w:i w:val="false"/>
+          <w:iCs w:val="false"/>
+          <w:color w:val="222222"/>
+        </w:rPr>
+        <w:t xml:space="preserve">Son 2 partes: primero subir la foto a Cloudinary, después copiar su link al Sheet.</w:t>
+      </w:r>
+    </w:p>
+    <w:p>
+      <w:pPr>
+        <w:pStyle w:val="Heading2"/>
+        <w:spacing w:after="120" w:before="280"/>
       </w:pPr>
       <w:r>
         <w:rPr>
@@ -1122,26 +1099,183 @@
           <w:bCs/>
           <w:color w:val="111111"/>
         </w:rPr>
-        <w:t xml:space="preserve">¿Cuánto tarda en verse el cambio en la página?</w:t>
-      </w:r>
-    </w:p>
-    <w:p>
-      <w:pPr>
-        <w:spacing w:after="160"/>
-      </w:pPr>
-      <w:r>
-        <w:rPr>
-          <w:i w:val="false"/>
-          <w:iCs w:val="false"/>
-          <w:color w:val="222222"/>
-        </w:rPr>
-        <w:t xml:space="preserve">Normalmente los cambios se reflejan en segundos. Si alguien tiene la página abierta desde antes, puede que necesite recargarla (F5 o deslizar hacia abajo en el celular) para ver lo último.</w:t>
-      </w:r>
-    </w:p>
-    <w:p>
-      <w:pPr>
-        <w:pStyle w:val="Heading1"/>
-        <w:spacing w:after="160" w:before="360"/>
+        <w:t xml:space="preserve">Parte 1 — Subir la foto a Cloudinary</w:t>
+      </w:r>
+    </w:p>
+    <w:p>
+      <w:pPr>
+        <w:pStyle w:val="ListParagraph"/>
+        <w:numPr>
+          <w:ilvl w:val="0"/>
+          <w:numId w:val="3"/>
+        </w:numPr>
+        <w:spacing w:after="100"/>
+      </w:pPr>
+      <w:r>
+        <w:rPr>
+          <w:color w:val="222222"/>
+        </w:rPr>
+        <w:t xml:space="preserve">Entrar a cloudinary.com/users/login en el navegador (Chrome, por ejemplo).</w:t>
+      </w:r>
+    </w:p>
+    <w:p>
+      <w:pPr>
+        <w:pStyle w:val="ListParagraph"/>
+        <w:numPr>
+          <w:ilvl w:val="0"/>
+          <w:numId w:val="3"/>
+        </w:numPr>
+        <w:spacing w:after="100"/>
+      </w:pPr>
+      <w:r>
+        <w:rPr>
+          <w:color w:val="222222"/>
+        </w:rPr>
+        <w:t xml:space="preserve">Iniciar sesión con la cuenta del negocio (pedir el correo y la contraseña a Juan Carlos si no los tienes).</w:t>
+      </w:r>
+    </w:p>
+    <w:p>
+      <w:pPr>
+        <w:pStyle w:val="ListParagraph"/>
+        <w:numPr>
+          <w:ilvl w:val="0"/>
+          <w:numId w:val="3"/>
+        </w:numPr>
+        <w:spacing w:after="100"/>
+      </w:pPr>
+      <w:r>
+        <w:rPr>
+          <w:color w:val="222222"/>
+        </w:rPr>
+        <w:t xml:space="preserve">En el menú de la izquierda, hacer clic en "Media Library" (biblioteca de fotos).</w:t>
+      </w:r>
+    </w:p>
+    <w:p>
+      <w:pPr>
+        <w:pStyle w:val="ListParagraph"/>
+        <w:numPr>
+          <w:ilvl w:val="0"/>
+          <w:numId w:val="3"/>
+        </w:numPr>
+        <w:spacing w:after="100"/>
+      </w:pPr>
+      <w:r>
+        <w:rPr>
+          <w:color w:val="222222"/>
+        </w:rPr>
+        <w:t xml:space="preserve">Hacer clic en el botón "Upload" (arriba a la derecha) o simplemente arrastrar la foto desde una carpeta del computador hasta esa pantalla.</w:t>
+      </w:r>
+    </w:p>
+    <w:p>
+      <w:pPr>
+        <w:pStyle w:val="ListParagraph"/>
+        <w:numPr>
+          <w:ilvl w:val="0"/>
+          <w:numId w:val="3"/>
+        </w:numPr>
+        <w:spacing w:after="100"/>
+      </w:pPr>
+      <w:r>
+        <w:rPr>
+          <w:color w:val="222222"/>
+        </w:rPr>
+        <w:t xml:space="preserve">Esperar a que la foto termine de subir (aparece una barra de progreso).</w:t>
+      </w:r>
+    </w:p>
+    <w:p>
+      <w:pPr>
+        <w:pStyle w:val="ListParagraph"/>
+        <w:numPr>
+          <w:ilvl w:val="0"/>
+          <w:numId w:val="3"/>
+        </w:numPr>
+        <w:spacing w:after="100"/>
+      </w:pPr>
+      <w:r>
+        <w:rPr>
+          <w:color w:val="222222"/>
+        </w:rPr>
+        <w:t xml:space="preserve">Hacer clic sobre la foto que se acaba de subir para abrirla, y buscar el botón o ícono que dice "Copy URL" (copiar link). Al hacer clic ahí, el link queda copiado.</w:t>
+      </w:r>
+    </w:p>
+    <w:tbl>
+      <w:tblPr>
+        <w:tblW w:type="dxa" w:w="9500"/>
+        <w:tblBorders>
+          <w:top w:val="single" w:color="auto" w:sz="4"/>
+          <w:left w:val="single" w:color="auto" w:sz="4"/>
+          <w:bottom w:val="single" w:color="auto" w:sz="4"/>
+          <w:right w:val="single" w:color="auto" w:sz="4"/>
+          <w:insideH w:val="single" w:color="auto" w:sz="4"/>
+          <w:insideV w:val="single" w:color="auto" w:sz="4"/>
+        </w:tblBorders>
+      </w:tblPr>
+      <w:tblGrid>
+        <w:gridCol w:w="9500"/>
+      </w:tblGrid>
+      <w:tr>
+        <w:tc>
+          <w:tcPr>
+            <w:tcW w:type="dxa" w:w="9500"/>
+            <w:shd w:fill="F4F4F4" w:val="clear"/>
+            <w:tcMar>
+              <w:top w:type="dxa" w:w="160"/>
+              <w:left w:type="dxa" w:w="200"/>
+              <w:bottom w:type="dxa" w:w="160"/>
+              <w:right w:type="dxa" w:w="200"/>
+            </w:tcMar>
+          </w:tcPr>
+          <w:p>
+            <w:pPr>
+              <w:spacing w:after="80"/>
+            </w:pPr>
+            <w:r>
+              <w:rPr>
+                <w:color w:val="222222"/>
+                <w:sz w:val="21"/>
+                <w:szCs w:val="21"/>
+              </w:rPr>
+              <w:t xml:space="preserve">El link copiado se ve más o menos así:</w:t>
+            </w:r>
+          </w:p>
+          <w:p>
+            <w:pPr>
+              <w:spacing w:after="80"/>
+            </w:pPr>
+            <w:r>
+              <w:rPr>
+                <w:color w:val="222222"/>
+                <w:sz w:val="21"/>
+                <w:szCs w:val="21"/>
+              </w:rPr>
+              <w:t xml:space="preserve">https://res.cloudinary.com/sa0ainfh/image/upload/v1234567890/tezcanela/nombre-de-la-foto.jpg</w:t>
+            </w:r>
+          </w:p>
+          <w:p>
+            <w:pPr>
+              <w:spacing w:after="0"/>
+            </w:pPr>
+            <w:r>
+              <w:rPr>
+                <w:color w:val="222222"/>
+                <w:sz w:val="21"/>
+                <w:szCs w:val="21"/>
+              </w:rPr>
+              <w:t xml:space="preserve">Ese es el que se pega en el Sheet (parte 2).</w:t>
+            </w:r>
+          </w:p>
+        </w:tc>
+      </w:tr>
+    </w:tbl>
+    <w:p>
+      <w:pPr>
+        <w:spacing w:after="200"/>
+      </w:pPr>
+    </w:p>
+    <w:p>
+      <w:pPr>
+        <w:pStyle w:val="Heading2"/>
+        <w:spacing w:after="120" w:before="280"/>
       </w:pPr>
       <w:r>
         <w:rPr>
@@ -1149,6 +1283,549 @@
           <w:bCs/>
           <w:color w:val="111111"/>
         </w:rPr>
+        <w:t xml:space="preserve">Parte 2 — Pegar el link en el Sheet</w:t>
+      </w:r>
+    </w:p>
+    <w:p>
+      <w:pPr>
+        <w:spacing w:after="160"/>
+      </w:pPr>
+      <w:r>
+        <w:rPr>
+          <w:b w:val="false"/>
+          <w:bCs w:val="false"/>
+          <w:i w:val="false"/>
+          <w:iCs w:val="false"/>
+          <w:color w:val="222222"/>
+        </w:rPr>
+        <w:t xml:space="preserve">En la pestaña "Imagenes" del Google Sheet, va una fila por cada foto:</w:t>
+      </w:r>
+    </w:p>
+    <w:tbl>
+      <w:tblPr>
+        <w:tblW w:type="dxa" w:w="8000"/>
+        <w:tblBorders>
+          <w:top w:val="single" w:color="auto" w:sz="4"/>
+          <w:left w:val="single" w:color="auto" w:sz="4"/>
+          <w:bottom w:val="single" w:color="auto" w:sz="4"/>
+          <w:right w:val="single" w:color="auto" w:sz="4"/>
+          <w:insideH w:val="single" w:color="auto" w:sz="4"/>
+          <w:insideV w:val="single" w:color="auto" w:sz="4"/>
+        </w:tblBorders>
+      </w:tblPr>
+      <w:tblGrid>
+        <w:gridCol w:w="1800"/>
+        <w:gridCol w:w="1200"/>
+        <w:gridCol w:w="5000"/>
+      </w:tblGrid>
+      <w:tr>
+        <w:tc>
+          <w:tcPr>
+            <w:tcW w:type="dxa" w:w="1800"/>
+            <w:shd w:fill="111111" w:val="clear"/>
+            <w:tcMar>
+              <w:top w:type="dxa" w:w="100"/>
+              <w:left w:type="dxa" w:w="120"/>
+              <w:bottom w:type="dxa" w:w="100"/>
+              <w:right w:type="dxa" w:w="120"/>
+            </w:tcMar>
+          </w:tcPr>
+          <w:p>
+            <w:r>
+              <w:rPr>
+                <w:b/>
+                <w:bCs/>
+                <w:color w:val="FFFFFF"/>
+                <w:sz w:val="20"/>
+                <w:szCs w:val="20"/>
+              </w:rPr>
+              <w:t xml:space="preserve">producto_id</w:t>
+            </w:r>
+          </w:p>
+        </w:tc>
+        <w:tc>
+          <w:tcPr>
+            <w:tcW w:type="dxa" w:w="1200"/>
+            <w:shd w:fill="111111" w:val="clear"/>
+            <w:tcMar>
+              <w:top w:type="dxa" w:w="100"/>
+              <w:left w:type="dxa" w:w="120"/>
+              <w:bottom w:type="dxa" w:w="100"/>
+              <w:right w:type="dxa" w:w="120"/>
+            </w:tcMar>
+          </w:tcPr>
+          <w:p>
+            <w:r>
+              <w:rPr>
+                <w:b/>
+                <w:bCs/>
+                <w:color w:val="FFFFFF"/>
+                <w:sz w:val="20"/>
+                <w:szCs w:val="20"/>
+              </w:rPr>
+              <w:t xml:space="preserve">orden</w:t>
+            </w:r>
+          </w:p>
+        </w:tc>
+        <w:tc>
+          <w:tcPr>
+            <w:tcW w:type="dxa" w:w="5000"/>
+            <w:shd w:fill="111111" w:val="clear"/>
+            <w:tcMar>
+              <w:top w:type="dxa" w:w="100"/>
+              <w:left w:type="dxa" w:w="120"/>
+              <w:bottom w:type="dxa" w:w="100"/>
+              <w:right w:type="dxa" w:w="120"/>
+            </w:tcMar>
+          </w:tcPr>
+          <w:p>
+            <w:r>
+              <w:rPr>
+                <w:b/>
+                <w:bCs/>
+                <w:color w:val="FFFFFF"/>
+                <w:sz w:val="20"/>
+                <w:szCs w:val="20"/>
+              </w:rPr>
+              <w:t xml:space="preserve">url</w:t>
+            </w:r>
+          </w:p>
+        </w:tc>
+      </w:tr>
+      <w:tr>
+        <w:tc>
+          <w:tcPr>
+            <w:tcW w:type="dxa" w:w="1800"/>
+            <w:tcMar>
+              <w:top w:type="dxa" w:w="100"/>
+              <w:left w:type="dxa" w:w="120"/>
+              <w:bottom w:type="dxa" w:w="100"/>
+              <w:right w:type="dxa" w:w="120"/>
+            </w:tcMar>
+          </w:tcPr>
+          <w:p>
+            <w:r>
+              <w:rPr>
+                <w:b w:val="false"/>
+                <w:bCs w:val="false"/>
+                <w:color w:val="222222"/>
+                <w:sz w:val="20"/>
+                <w:szCs w:val="20"/>
+              </w:rPr>
+              <w:t xml:space="preserve">p1</w:t>
+            </w:r>
+          </w:p>
+        </w:tc>
+        <w:tc>
+          <w:tcPr>
+            <w:tcW w:type="dxa" w:w="1200"/>
+            <w:tcMar>
+              <w:top w:type="dxa" w:w="100"/>
+              <w:left w:type="dxa" w:w="120"/>
+              <w:bottom w:type="dxa" w:w="100"/>
+              <w:right w:type="dxa" w:w="120"/>
+            </w:tcMar>
+          </w:tcPr>
+          <w:p>
+            <w:r>
+              <w:rPr>
+                <w:b w:val="false"/>
+                <w:bCs w:val="false"/>
+                <w:color w:val="222222"/>
+                <w:sz w:val="20"/>
+                <w:szCs w:val="20"/>
+              </w:rPr>
+              <w:t xml:space="preserve">1</w:t>
+            </w:r>
+          </w:p>
+        </w:tc>
+        <w:tc>
+          <w:tcPr>
+            <w:tcW w:type="dxa" w:w="5000"/>
+            <w:tcMar>
+              <w:top w:type="dxa" w:w="100"/>
+              <w:left w:type="dxa" w:w="120"/>
+              <w:bottom w:type="dxa" w:w="100"/>
+              <w:right w:type="dxa" w:w="120"/>
+            </w:tcMar>
+          </w:tcPr>
+          <w:p>
+            <w:r>
+              <w:rPr>
+                <w:b w:val="false"/>
+                <w:bCs w:val="false"/>
+                <w:color w:val="222222"/>
+                <w:sz w:val="20"/>
+                <w:szCs w:val="20"/>
+              </w:rPr>
+              <w:t xml:space="preserve">https://res.cloudinary.com/.../p1_foto1.jpg</w:t>
+            </w:r>
+          </w:p>
+        </w:tc>
+      </w:tr>
+      <w:tr>
+        <w:tc>
+          <w:tcPr>
+            <w:tcW w:type="dxa" w:w="1800"/>
+            <w:tcMar>
+              <w:top w:type="dxa" w:w="100"/>
+              <w:left w:type="dxa" w:w="120"/>
+              <w:bottom w:type="dxa" w:w="100"/>
+              <w:right w:type="dxa" w:w="120"/>
+            </w:tcMar>
+          </w:tcPr>
+          <w:p>
+            <w:r>
+              <w:rPr>
+                <w:b w:val="false"/>
+                <w:bCs w:val="false"/>
+                <w:color w:val="222222"/>
+                <w:sz w:val="20"/>
+                <w:szCs w:val="20"/>
+              </w:rPr>
+              <w:t xml:space="preserve">p1</w:t>
+            </w:r>
+          </w:p>
+        </w:tc>
+        <w:tc>
+          <w:tcPr>
+            <w:tcW w:type="dxa" w:w="1200"/>
+            <w:tcMar>
+              <w:top w:type="dxa" w:w="100"/>
+              <w:left w:type="dxa" w:w="120"/>
+              <w:bottom w:type="dxa" w:w="100"/>
+              <w:right w:type="dxa" w:w="120"/>
+            </w:tcMar>
+          </w:tcPr>
+          <w:p>
+            <w:r>
+              <w:rPr>
+                <w:b w:val="false"/>
+                <w:bCs w:val="false"/>
+                <w:color w:val="222222"/>
+                <w:sz w:val="20"/>
+                <w:szCs w:val="20"/>
+              </w:rPr>
+              <w:t xml:space="preserve">2</w:t>
+            </w:r>
+          </w:p>
+        </w:tc>
+        <w:tc>
+          <w:tcPr>
+            <w:tcW w:type="dxa" w:w="5000"/>
+            <w:tcMar>
+              <w:top w:type="dxa" w:w="100"/>
+              <w:left w:type="dxa" w:w="120"/>
+              <w:bottom w:type="dxa" w:w="100"/>
+              <w:right w:type="dxa" w:w="120"/>
+            </w:tcMar>
+          </w:tcPr>
+          <w:p>
+            <w:r>
+              <w:rPr>
+                <w:b w:val="false"/>
+                <w:bCs w:val="false"/>
+                <w:color w:val="222222"/>
+                <w:sz w:val="20"/>
+                <w:szCs w:val="20"/>
+              </w:rPr>
+              <w:t xml:space="preserve">https://res.cloudinary.com/.../p1_foto2.jpg</w:t>
+            </w:r>
+          </w:p>
+        </w:tc>
+      </w:tr>
+    </w:tbl>
+    <w:p>
+      <w:pPr>
+        <w:spacing w:after="200"/>
+      </w:pPr>
+    </w:p>
+    <w:p>
+      <w:pPr>
+        <w:pStyle w:val="ListParagraph"/>
+        <w:numPr>
+          <w:ilvl w:val="0"/>
+          <w:numId w:val="3"/>
+        </w:numPr>
+        <w:spacing w:after="100"/>
+      </w:pPr>
+      <w:r>
+        <w:rPr>
+          <w:color w:val="222222"/>
+        </w:rPr>
+        <w:t xml:space="preserve">Ir a la primera fila vacía de la pestaña "Imagenes".</w:t>
+      </w:r>
+    </w:p>
+    <w:p>
+      <w:pPr>
+        <w:pStyle w:val="ListParagraph"/>
+        <w:numPr>
+          <w:ilvl w:val="0"/>
+          <w:numId w:val="3"/>
+        </w:numPr>
+        <w:spacing w:after="100"/>
+      </w:pPr>
+      <w:r>
+        <w:rPr>
+          <w:color w:val="222222"/>
+        </w:rPr>
+        <w:t xml:space="preserve">En "producto_id" escribir el mismo id del producto (el mismo que usaste en la pestaña Productos).</w:t>
+      </w:r>
+    </w:p>
+    <w:p>
+      <w:pPr>
+        <w:pStyle w:val="ListParagraph"/>
+        <w:numPr>
+          <w:ilvl w:val="0"/>
+          <w:numId w:val="3"/>
+        </w:numPr>
+        <w:spacing w:after="100"/>
+      </w:pPr>
+      <w:r>
+        <w:rPr>
+          <w:color w:val="222222"/>
+        </w:rPr>
+        <w:t xml:space="preserve">En "orden" escribir 1 si es la primera foto de ese producto (la que se ve primero en el catálogo), 2 si es la segunda foto, y así sucesivamente.</w:t>
+      </w:r>
+    </w:p>
+    <w:p>
+      <w:pPr>
+        <w:pStyle w:val="ListParagraph"/>
+        <w:numPr>
+          <w:ilvl w:val="0"/>
+          <w:numId w:val="3"/>
+        </w:numPr>
+        <w:spacing w:after="100"/>
+      </w:pPr>
+      <w:r>
+        <w:rPr>
+          <w:color w:val="222222"/>
+        </w:rPr>
+        <w:t xml:space="preserve">En "url" pegar el link que copiaste de Cloudinary (Cmd+V o clic derecho → Pegar).</w:t>
+      </w:r>
+    </w:p>
+    <w:p>
+      <w:pPr>
+        <w:pStyle w:val="ListParagraph"/>
+        <w:numPr>
+          <w:ilvl w:val="0"/>
+          <w:numId w:val="3"/>
+        </w:numPr>
+        <w:spacing w:after="100"/>
+      </w:pPr>
+      <w:r>
+        <w:rPr>
+          <w:color w:val="222222"/>
+        </w:rPr>
+        <w:t xml:space="preserve">Si el producto tiene más de una foto, repetir estos mismos pasos: subirla a Cloudinary, copiar su link, y agregar una fila nueva con el mismo producto_id pero el siguiente número de "orden".</w:t>
+      </w:r>
+    </w:p>
+    <w:tbl>
+      <w:tblPr>
+        <w:tblW w:type="dxa" w:w="9500"/>
+        <w:tblBorders>
+          <w:top w:val="single" w:color="auto" w:sz="4"/>
+          <w:left w:val="single" w:color="auto" w:sz="4"/>
+          <w:bottom w:val="single" w:color="auto" w:sz="4"/>
+          <w:right w:val="single" w:color="auto" w:sz="4"/>
+          <w:insideH w:val="single" w:color="auto" w:sz="4"/>
+          <w:insideV w:val="single" w:color="auto" w:sz="4"/>
+        </w:tblBorders>
+      </w:tblPr>
+      <w:tblGrid>
+        <w:gridCol w:w="9500"/>
+      </w:tblGrid>
+      <w:tr>
+        <w:tc>
+          <w:tcPr>
+            <w:tcW w:type="dxa" w:w="9500"/>
+            <w:shd w:fill="F4F4F4" w:val="clear"/>
+            <w:tcMar>
+              <w:top w:type="dxa" w:w="160"/>
+              <w:left w:type="dxa" w:w="200"/>
+              <w:bottom w:type="dxa" w:w="160"/>
+              <w:right w:type="dxa" w:w="200"/>
+            </w:tcMar>
+          </w:tcPr>
+          <w:p>
+            <w:pPr>
+              <w:spacing w:after="80"/>
+            </w:pPr>
+            <w:r>
+              <w:rPr>
+                <w:color w:val="222222"/>
+                <w:sz w:val="21"/>
+                <w:szCs w:val="21"/>
+              </w:rPr>
+              <w:t xml:space="preserve">¿Por qué no se pueden usar fotos de Google Drive o de Google Fotos?</w:t>
+            </w:r>
+          </w:p>
+          <w:p>
+            <w:pPr>
+              <w:spacing w:after="0"/>
+            </w:pPr>
+            <w:r>
+              <w:rPr>
+                <w:color w:val="222222"/>
+                <w:sz w:val="21"/>
+                <w:szCs w:val="21"/>
+              </w:rPr>
+              <w:t xml:space="preserve">Se probó y esos servicios no dejan que sus fotos se muestren dentro de otra página web — por eso hay que usar Cloudinary, que sí está hecho para esto.</w:t>
+            </w:r>
+          </w:p>
+        </w:tc>
+      </w:tr>
+    </w:tbl>
+    <w:p>
+      <w:pPr>
+        <w:pStyle w:val="Heading1"/>
+        <w:spacing w:after="160" w:before="360"/>
+      </w:pPr>
+      <w:r>
+        <w:rPr>
+          <w:b/>
+          <w:bCs/>
+          <w:color w:val="111111"/>
+        </w:rPr>
+        <w:t xml:space="preserve">Reglas importantes — qué NO hacer</w:t>
+      </w:r>
+    </w:p>
+    <w:p>
+      <w:pPr>
+        <w:pStyle w:val="ListParagraph"/>
+        <w:numPr>
+          <w:ilvl w:val="0"/>
+          <w:numId w:val="4"/>
+        </w:numPr>
+        <w:spacing w:after="80"/>
+      </w:pPr>
+      <w:r>
+        <w:rPr>
+          <w:color w:val="222222"/>
+        </w:rPr>
+        <w:t xml:space="preserve">No cambiar los nombres de las pestañas ("Productos", "Variantes" e "Imagenes").</w:t>
+      </w:r>
+    </w:p>
+    <w:p>
+      <w:pPr>
+        <w:pStyle w:val="ListParagraph"/>
+        <w:numPr>
+          <w:ilvl w:val="0"/>
+          <w:numId w:val="4"/>
+        </w:numPr>
+        <w:spacing w:after="80"/>
+      </w:pPr>
+      <w:r>
+        <w:rPr>
+          <w:color w:val="222222"/>
+        </w:rPr>
+        <w:t xml:space="preserve">No cambiar ni borrar los encabezados de las columnas (la primera fila de cada pestaña).</w:t>
+      </w:r>
+    </w:p>
+    <w:p>
+      <w:pPr>
+        <w:pStyle w:val="ListParagraph"/>
+        <w:numPr>
+          <w:ilvl w:val="0"/>
+          <w:numId w:val="4"/>
+        </w:numPr>
+        <w:spacing w:after="80"/>
+      </w:pPr>
+      <w:r>
+        <w:rPr>
+          <w:color w:val="222222"/>
+        </w:rPr>
+        <w:t xml:space="preserve">No dejar el "id" o "producto_id" vacío — sin eso el producto no se puede relacionar con sus tallas, colores o fotos.</w:t>
+      </w:r>
+    </w:p>
+    <w:p>
+      <w:pPr>
+        <w:pStyle w:val="ListParagraph"/>
+        <w:numPr>
+          <w:ilvl w:val="0"/>
+          <w:numId w:val="4"/>
+        </w:numPr>
+        <w:spacing w:after="80"/>
+      </w:pPr>
+      <w:r>
+        <w:rPr>
+          <w:color w:val="222222"/>
+        </w:rPr>
+        <w:t xml:space="preserve">No repetir el mismo "id" en dos productos distintos.</w:t>
+      </w:r>
+    </w:p>
+    <w:p>
+      <w:pPr>
+        <w:pStyle w:val="ListParagraph"/>
+        <w:numPr>
+          <w:ilvl w:val="0"/>
+          <w:numId w:val="4"/>
+        </w:numPr>
+        <w:spacing w:after="80"/>
+      </w:pPr>
+      <w:r>
+        <w:rPr>
+          <w:color w:val="222222"/>
+        </w:rPr>
+        <w:t xml:space="preserve">En "precio", "stock" y "orden" escribir solo números, sin texto ni símbolos.</w:t>
+      </w:r>
+    </w:p>
+    <w:p>
+      <w:pPr>
+        <w:pStyle w:val="ListParagraph"/>
+        <w:numPr>
+          <w:ilvl w:val="0"/>
+          <w:numId w:val="4"/>
+        </w:numPr>
+        <w:spacing w:after="80"/>
+      </w:pPr>
+      <w:r>
+        <w:rPr>
+          <w:color w:val="222222"/>
+        </w:rPr>
+        <w:t xml:space="preserve">En "url" (pestaña Imagenes) pegar siempre el link de Cloudinary, nunca el de Google Drive o Google Fotos.</w:t>
+      </w:r>
+    </w:p>
+    <w:p>
+      <w:pPr>
+        <w:pStyle w:val="Heading1"/>
+        <w:spacing w:after="160" w:before="360"/>
+      </w:pPr>
+      <w:r>
+        <w:rPr>
+          <w:b/>
+          <w:bCs/>
+          <w:color w:val="111111"/>
+        </w:rPr>
+        <w:t xml:space="preserve">¿Cuánto tarda en verse el cambio en la página?</w:t>
+      </w:r>
+    </w:p>
+    <w:p>
+      <w:pPr>
+        <w:spacing w:after="160"/>
+      </w:pPr>
+      <w:r>
+        <w:rPr>
+          <w:b w:val="false"/>
+          <w:bCs w:val="false"/>
+          <w:i w:val="false"/>
+          <w:iCs w:val="false"/>
+          <w:color w:val="222222"/>
+        </w:rPr>
+        <w:t xml:space="preserve">Normalmente los cambios se reflejan en unos minutos (hasta 5 minutos, porque la página guarda una copia temporal de los datos para cargar más rápido). Si alguien tiene la página abierta desde antes, puede que necesite recargarla (F5 o deslizar hacia abajo en el celular) para ver lo último.</w:t>
+      </w:r>
+    </w:p>
+    <w:p>
+      <w:pPr>
+        <w:pStyle w:val="Heading1"/>
+        <w:spacing w:after="160" w:before="360"/>
+      </w:pPr>
+      <w:r>
+        <w:rPr>
+          <w:b/>
+          <w:bCs/>
+          <w:color w:val="111111"/>
+        </w:rPr>
         <w:t xml:space="preserve">¿Dudas o algo no se ve bien?</w:t>
       </w:r>
     </w:p>
@@ -1158,6 +1835,8 @@
       </w:pPr>
       <w:r>
         <w:rPr>
+          <w:b w:val="false"/>
+          <w:bCs w:val="false"/>
           <w:i w:val="false"/>
           <w:iCs w:val="false"/>
           <w:color w:val="222222"/>
@@ -1363,6 +2042,18 @@
       </w:pPr>
     </w:lvl>
   </w:abstractNum>
+  <w:abstractNum w:abstractNumId="4" w15:restartNumberingAfterBreak="0">
+    <w:multiLevelType w:val="hybridMultilevel"/>
+    <w:lvl w:ilvl="0" w15:tentative="1">
+      <w:start w:val="1"/>
+      <w:numFmt w:val="decimal"/>
+      <w:lvlText w:val="%1."/>
+      <w:lvlJc w:val="left"/>
+      <w:pPr>
+        <w:ind w:left="420" w:hanging="260"/>
+      </w:pPr>
+    </w:lvl>
+  </w:abstractNum>
   <w:num w:numId="1">
     <w:abstractNumId w:val="1"/>
     <w:lvlOverride w:ilvl="0">
@@ -1376,6 +2067,12 @@
     </w:lvlOverride>
   </w:num>
   <w:num w:numId="3">
+    <w:abstractNumId w:val="4"/>
+    <w:lvlOverride w:ilvl="0">
+      <w:startOverride w:val="1"/>
+    </w:lvlOverride>
+  </w:num>
+  <w:num w:numId="4">
     <w:abstractNumId w:val="2"/>
     <w:lvlOverride w:ilvl="0">
       <w:startOverride w:val="1"/>

</xml_diff>